<commit_message>
Rebuild three pack PDFs: full pages, brand bar, section-name references
Fixes the auto-generated look (one section per page, empty bottoms). Content now flows to fill each page; brand header bar/footer on every page; page-number cross-references reworded to section names; A4. Applies to the live PDF and editable Word download. Built with the reusable pack-layout generator.

Co-Authored-By: Claude Opus 4.8 <noreply@anthropic.com>
</commit_message>
<xml_diff>
--- a/resources/a-level-business-evaluation-which-sentence-earns-which-mark/A-Level-Business-Evaluation-Which-Sentence-Earns-Which-Mark-Community-Edition-EDITABLE.docx
+++ b/resources/a-level-business-evaluation-which-sentence-earns-which-mark/A-Level-Business-Evaluation-Which-Sentence-Earns-Which-Mark-Community-Edition-EDITABLE.docx
@@ -34,13 +34,9 @@
       </w:r>
     </w:p>
     <w:p>
-      <w:r>
-        <w:br w:type="page"/>
-      </w:r>
-    </w:p>
-    <w:p>
       <w:pPr>
         <w:pStyle w:val="Heading1"/>
+        <w:keepNext/>
       </w:pPr>
       <w:r>
         <w:rPr>
@@ -52,6 +48,7 @@
     <w:p>
       <w:pPr>
         <w:pStyle w:val="Heading2"/>
+        <w:keepNext/>
       </w:pPr>
       <w:r>
         <w:rPr>
@@ -73,6 +70,7 @@
     <w:p>
       <w:pPr>
         <w:pStyle w:val="Heading2"/>
+        <w:keepNext/>
       </w:pPr>
       <w:r>
         <w:rPr>
@@ -94,6 +92,7 @@
     <w:p>
       <w:pPr>
         <w:pStyle w:val="Heading2"/>
+        <w:keepNext/>
       </w:pPr>
       <w:r>
         <w:rPr>
@@ -115,6 +114,7 @@
     <w:p>
       <w:pPr>
         <w:pStyle w:val="Heading2"/>
+        <w:keepNext/>
       </w:pPr>
       <w:r>
         <w:rPr>
@@ -136,6 +136,7 @@
     <w:p>
       <w:pPr>
         <w:pStyle w:val="Heading2"/>
+        <w:keepNext/>
       </w:pPr>
       <w:r>
         <w:rPr>
@@ -157,6 +158,7 @@
     <w:p>
       <w:pPr>
         <w:pStyle w:val="Heading2"/>
+        <w:keepNext/>
       </w:pPr>
       <w:r>
         <w:rPr>
@@ -176,13 +178,9 @@
       </w:r>
     </w:p>
     <w:p>
-      <w:r>
-        <w:br w:type="page"/>
-      </w:r>
-    </w:p>
-    <w:p>
       <w:pPr>
         <w:pStyle w:val="Heading1"/>
+        <w:keepNext/>
       </w:pPr>
       <w:r>
         <w:rPr>
@@ -388,6 +386,7 @@
     <w:p>
       <w:pPr>
         <w:pStyle w:val="Heading2"/>
+        <w:keepNext/>
       </w:pPr>
       <w:r>
         <w:rPr>
@@ -706,6 +705,7 @@
     <w:p>
       <w:pPr>
         <w:pStyle w:val="Heading2"/>
+        <w:keepNext/>
       </w:pPr>
       <w:r>
         <w:rPr>
@@ -1129,6 +1129,7 @@
     <w:p>
       <w:pPr>
         <w:pStyle w:val="Heading2"/>
+        <w:keepNext/>
       </w:pPr>
       <w:r>
         <w:rPr>
@@ -1418,13 +1419,9 @@
       </w:tr>
     </w:tbl>
     <w:p>
-      <w:r>
-        <w:br w:type="page"/>
-      </w:r>
-    </w:p>
-    <w:p>
       <w:pPr>
         <w:pStyle w:val="Heading1"/>
+        <w:keepNext/>
       </w:pPr>
       <w:r>
         <w:rPr>
@@ -1725,6 +1722,7 @@
     <w:p>
       <w:pPr>
         <w:pStyle w:val="Heading2"/>
+        <w:keepNext/>
       </w:pPr>
       <w:r>
         <w:rPr>
@@ -1929,6 +1927,7 @@
     <w:p>
       <w:pPr>
         <w:pStyle w:val="Heading2"/>
+        <w:keepNext/>
       </w:pPr>
       <w:r>
         <w:rPr>
@@ -2203,6 +2202,7 @@
     <w:p>
       <w:pPr>
         <w:pStyle w:val="Heading2"/>
+        <w:keepNext/>
       </w:pPr>
       <w:r>
         <w:rPr>
@@ -2234,6 +2234,7 @@
     <w:p>
       <w:pPr>
         <w:pStyle w:val="Heading2"/>
+        <w:keepNext/>
       </w:pPr>
       <w:r>
         <w:rPr>
@@ -2263,13 +2264,9 @@
       </w:r>
     </w:p>
     <w:p>
-      <w:r>
-        <w:br w:type="page"/>
-      </w:r>
-    </w:p>
-    <w:p>
       <w:pPr>
         <w:pStyle w:val="Heading2"/>
+        <w:keepNext/>
       </w:pPr>
       <w:r>
         <w:rPr>
@@ -3409,13 +3406,9 @@
       </w:r>
     </w:p>
     <w:p>
-      <w:r>
-        <w:br w:type="page"/>
-      </w:r>
-    </w:p>
-    <w:p>
       <w:pPr>
         <w:pStyle w:val="Heading2"/>
+        <w:keepNext/>
       </w:pPr>
       <w:r>
         <w:rPr>
@@ -4325,6 +4318,7 @@
     <w:p>
       <w:pPr>
         <w:pStyle w:val="Heading2"/>
+        <w:keepNext/>
       </w:pPr>
       <w:r>
         <w:rPr>
@@ -4826,13 +4820,9 @@
       </w:r>
     </w:p>
     <w:p>
-      <w:r>
-        <w:br w:type="page"/>
-      </w:r>
-    </w:p>
-    <w:p>
       <w:pPr>
         <w:pStyle w:val="Heading2"/>
+        <w:keepNext/>
       </w:pPr>
       <w:r>
         <w:rPr>
@@ -5326,6 +5316,7 @@
     <w:p>
       <w:pPr>
         <w:pStyle w:val="Heading2"/>
+        <w:keepNext/>
       </w:pPr>
       <w:r>
         <w:rPr>
@@ -5712,13 +5703,9 @@
       </w:r>
     </w:p>
     <w:p>
-      <w:r>
-        <w:br w:type="page"/>
-      </w:r>
-    </w:p>
-    <w:p>
       <w:pPr>
         <w:pStyle w:val="Heading1"/>
+        <w:keepNext/>
       </w:pPr>
       <w:r>
         <w:rPr>
@@ -5730,6 +5717,7 @@
     <w:p>
       <w:pPr>
         <w:pStyle w:val="Heading2"/>
+        <w:keepNext/>
       </w:pPr>
       <w:r>
         <w:rPr>
@@ -5771,6 +5759,7 @@
     <w:p>
       <w:pPr>
         <w:pStyle w:val="Heading2"/>
+        <w:keepNext/>
       </w:pPr>
       <w:r>
         <w:rPr>
@@ -5974,6 +5963,7 @@
     <w:p>
       <w:pPr>
         <w:pStyle w:val="Heading2"/>
+        <w:keepNext/>
       </w:pPr>
       <w:r>
         <w:rPr>
@@ -5999,7 +5989,7 @@
           <w:i w:val="0"/>
           <w:sz w:val="21"/>
         </w:rPr>
-        <w:t>10 min. The four objectives, page 5. One sentence each, then leave the table on the board for the whole unit.</w:t>
+        <w:t>10 min. The four objectives. One sentence each, then leave the table on the board for the whole unit.</w:t>
       </w:r>
     </w:p>
     <w:p>
@@ -6009,7 +5999,7 @@
           <w:i w:val="0"/>
           <w:sz w:val="21"/>
         </w:rPr>
-        <w:t>10 min. Read the mid band answer on page 17 without the annotation. Ask the class to mark it out of 25. Collect three numbers and write them up.</w:t>
+        <w:t>10 min. Read the mid band answer without the annotation. Ask the class to mark it out of 25. Collect three numbers and write them up.</w:t>
       </w:r>
     </w:p>
     <w:p>
@@ -6029,7 +6019,7 @@
           <w:i w:val="0"/>
           <w:sz w:val="21"/>
         </w:rPr>
-        <w:t>15 min. Students tag the mid band answer themselves using the key on page 8, then total by objective.</w:t>
+        <w:t>15 min. Students tag the mid band answer themselves using the key, then total by objective.</w:t>
       </w:r>
     </w:p>
     <w:p>
@@ -6045,6 +6035,7 @@
     <w:p>
       <w:pPr>
         <w:pStyle w:val="Heading2"/>
+        <w:keepNext/>
       </w:pPr>
       <w:r>
         <w:rPr>
@@ -6060,7 +6051,7 @@
           <w:i w:val="0"/>
           <w:sz w:val="21"/>
         </w:rPr>
-        <w:t>The four objectives, page 5.</w:t>
+        <w:t>The four objectives.</w:t>
       </w:r>
     </w:p>
     <w:p>
@@ -6070,7 +6061,7 @@
           <w:i w:val="0"/>
           <w:sz w:val="21"/>
         </w:rPr>
-        <w:t>Tag key, page 8.</w:t>
+        <w:t>Tag key.</w:t>
       </w:r>
     </w:p>
     <w:p>
@@ -6080,12 +6071,13 @@
           <w:i w:val="0"/>
           <w:sz w:val="21"/>
         </w:rPr>
-        <w:t>Mid band answer, page 17, one per student.</w:t>
+        <w:t>Mid band answer, one per student.</w:t>
       </w:r>
     </w:p>
     <w:p>
       <w:pPr>
         <w:pStyle w:val="Heading2"/>
+        <w:keepNext/>
       </w:pPr>
       <w:r>
         <w:rPr>
@@ -6105,13 +6097,9 @@
       </w:r>
     </w:p>
     <w:p>
-      <w:r>
-        <w:br w:type="page"/>
-      </w:r>
-    </w:p>
-    <w:p>
       <w:pPr>
         <w:pStyle w:val="Heading1"/>
+        <w:keepNext/>
       </w:pPr>
       <w:r>
         <w:rPr>
@@ -6123,6 +6111,7 @@
     <w:p>
       <w:pPr>
         <w:pStyle w:val="Heading2"/>
+        <w:keepNext/>
       </w:pPr>
       <w:r>
         <w:rPr>
@@ -6164,6 +6153,7 @@
     <w:p>
       <w:pPr>
         <w:pStyle w:val="Heading2"/>
+        <w:keepNext/>
       </w:pPr>
       <w:r>
         <w:rPr>
@@ -6367,6 +6357,7 @@
     <w:p>
       <w:pPr>
         <w:pStyle w:val="Heading2"/>
+        <w:keepNext/>
       </w:pPr>
       <w:r>
         <w:rPr>
@@ -6392,7 +6383,7 @@
           <w:i w:val="0"/>
           <w:sz w:val="21"/>
         </w:rPr>
-        <w:t>18 min. The annotated model on pages 11 and 12. Read it in order with the annotation covered, then reveal it a sentence at a time. Stop properly on sentence 7 and sentence 12.</w:t>
+        <w:t>18 min. The annotated model. Read it in order with the annotation covered, then reveal it a sentence at a time. Stop properly on sentence 7 and sentence 12.</w:t>
       </w:r>
     </w:p>
     <w:p>
@@ -6412,7 +6403,7 @@
           <w:i w:val="0"/>
           <w:sz w:val="21"/>
         </w:rPr>
-        <w:t>12 min. Model 2 on pages 14 and 15, same skill, other board, different question style. Read sentences 1 to 8 only and ask where the answer reaches a position.</w:t>
+        <w:t>12 min. Model 2, same skill, other board, different question style. Read sentences 1 to 8 only and ask where the answer reaches a position.</w:t>
       </w:r>
     </w:p>
     <w:p>
@@ -6422,7 +6413,7 @@
           <w:i w:val="0"/>
           <w:sz w:val="21"/>
         </w:rPr>
-        <w:t>12 min. Students write three evaluative sentences about Verity using three different shapes from page 20.</w:t>
+        <w:t>12 min. Students write three evaluative sentences about Verity using three different shapes.</w:t>
       </w:r>
     </w:p>
     <w:p>
@@ -6438,6 +6429,7 @@
     <w:p>
       <w:pPr>
         <w:pStyle w:val="Heading2"/>
+        <w:keepNext/>
       </w:pPr>
       <w:r>
         <w:rPr>
@@ -6453,7 +6445,7 @@
           <w:i w:val="0"/>
           <w:sz w:val="21"/>
         </w:rPr>
-        <w:t>Annotated model 1, pages 11 and 12.</w:t>
+        <w:t>Annotated model 1.</w:t>
       </w:r>
     </w:p>
     <w:p>
@@ -6463,7 +6455,7 @@
           <w:i w:val="0"/>
           <w:sz w:val="21"/>
         </w:rPr>
-        <w:t>Annotated model 2, pages 14 and 15.</w:t>
+        <w:t>Annotated model 2.</w:t>
       </w:r>
     </w:p>
     <w:p>
@@ -6473,7 +6465,7 @@
           <w:i w:val="0"/>
           <w:sz w:val="21"/>
         </w:rPr>
-        <w:t>The twelve shapes, page 20.</w:t>
+        <w:t>The twelve shapes.</w:t>
       </w:r>
     </w:p>
     <w:p>
@@ -6483,12 +6475,13 @@
           <w:i w:val="0"/>
           <w:sz w:val="21"/>
         </w:rPr>
-        <w:t>Case and figures, pages 9 and 10.</w:t>
+        <w:t>Case and figures.</w:t>
       </w:r>
     </w:p>
     <w:p>
       <w:pPr>
         <w:pStyle w:val="Heading2"/>
+        <w:keepNext/>
       </w:pPr>
       <w:r>
         <w:rPr>
@@ -6508,13 +6501,9 @@
       </w:r>
     </w:p>
     <w:p>
-      <w:r>
-        <w:br w:type="page"/>
-      </w:r>
-    </w:p>
-    <w:p>
       <w:pPr>
         <w:pStyle w:val="Heading1"/>
+        <w:keepNext/>
       </w:pPr>
       <w:r>
         <w:rPr>
@@ -6526,6 +6515,7 @@
     <w:p>
       <w:pPr>
         <w:pStyle w:val="Heading2"/>
+        <w:keepNext/>
       </w:pPr>
       <w:r>
         <w:rPr>
@@ -6567,6 +6557,7 @@
     <w:p>
       <w:pPr>
         <w:pStyle w:val="Heading2"/>
+        <w:keepNext/>
       </w:pPr>
       <w:r>
         <w:rPr>
@@ -6770,6 +6761,7 @@
     <w:p>
       <w:pPr>
         <w:pStyle w:val="Heading2"/>
+        <w:keepNext/>
       </w:pPr>
       <w:r>
         <w:rPr>
@@ -6795,7 +6787,7 @@
           <w:i w:val="0"/>
           <w:sz w:val="21"/>
         </w:rPr>
-        <w:t>18 min. Rewrite the mid band answer on the board with the class, one sentence at a time, using the fixes on page 18. Delete a sentence in front of them and let the discomfort happen.</w:t>
+        <w:t>18 min. Rewrite the mid band answer on the board with the class, one sentence at a time, using the fixes. Delete a sentence in front of them and let the discomfort happen.</w:t>
       </w:r>
     </w:p>
     <w:p>
@@ -6805,7 +6797,7 @@
           <w:i w:val="0"/>
           <w:sz w:val="21"/>
         </w:rPr>
-        <w:t>7 min. Now show the short model on page 16. Seven sentences, same band as the eighteen sentence version. This is the moment the length argument dies, and it only works after they have watched you delete.</w:t>
+        <w:t>7 min. Now show the short model. Seven sentences, same band as the eighteen sentence version. This is the moment the length argument dies, and it only works after they have watched you delete.</w:t>
       </w:r>
     </w:p>
     <w:p>
@@ -6841,6 +6833,7 @@
     <w:p>
       <w:pPr>
         <w:pStyle w:val="Heading2"/>
+        <w:keepNext/>
       </w:pPr>
       <w:r>
         <w:rPr>
@@ -6856,7 +6849,7 @@
           <w:i w:val="0"/>
           <w:sz w:val="21"/>
         </w:rPr>
-        <w:t>Mid band answer, page 17.</w:t>
+        <w:t>Mid band answer.</w:t>
       </w:r>
     </w:p>
     <w:p>
@@ -6866,7 +6859,7 @@
           <w:i w:val="0"/>
           <w:sz w:val="21"/>
         </w:rPr>
-        <w:t>The fixes, page 18.</w:t>
+        <w:t>The fixes.</w:t>
       </w:r>
     </w:p>
     <w:p>
@@ -6876,7 +6869,7 @@
           <w:i w:val="0"/>
           <w:sz w:val="21"/>
         </w:rPr>
-        <w:t>The short model, page 16.</w:t>
+        <w:t>The short model.</w:t>
       </w:r>
     </w:p>
     <w:p>
@@ -6892,6 +6885,7 @@
     <w:p>
       <w:pPr>
         <w:pStyle w:val="Heading2"/>
+        <w:keepNext/>
       </w:pPr>
       <w:r>
         <w:rPr>
@@ -6911,13 +6905,9 @@
       </w:r>
     </w:p>
     <w:p>
-      <w:r>
-        <w:br w:type="page"/>
-      </w:r>
-    </w:p>
-    <w:p>
       <w:pPr>
         <w:pStyle w:val="Heading1"/>
+        <w:keepNext/>
       </w:pPr>
       <w:r>
         <w:rPr>
@@ -6929,6 +6919,7 @@
     <w:p>
       <w:pPr>
         <w:pStyle w:val="Heading2"/>
+        <w:keepNext/>
       </w:pPr>
       <w:r>
         <w:rPr>
@@ -6970,6 +6961,7 @@
     <w:p>
       <w:pPr>
         <w:pStyle w:val="Heading2"/>
+        <w:keepNext/>
       </w:pPr>
       <w:r>
         <w:rPr>
@@ -7173,6 +7165,7 @@
     <w:p>
       <w:pPr>
         <w:pStyle w:val="Heading2"/>
+        <w:keepNext/>
       </w:pPr>
       <w:r>
         <w:rPr>
@@ -7198,7 +7191,7 @@
           <w:i w:val="0"/>
           <w:sz w:val="21"/>
         </w:rPr>
-        <w:t>5 min. Plan only, using the frame on page 21. Students write their one sentence answer and name their criterion.</w:t>
+        <w:t>5 min. Plan only, using the frame. Students write their one sentence answer and name their criterion.</w:t>
       </w:r>
     </w:p>
     <w:p>
@@ -7218,7 +7211,7 @@
           <w:i w:val="0"/>
           <w:sz w:val="21"/>
         </w:rPr>
-        <w:t>12 min. Swap. Tag the answer sentence by sentence with the key on page 8, total by objective, and write one specific improvement.</w:t>
+        <w:t>12 min. Swap. Tag the answer sentence by sentence with the key, total by objective, and write one specific improvement.</w:t>
       </w:r>
     </w:p>
     <w:p>
@@ -7234,6 +7227,7 @@
     <w:p>
       <w:pPr>
         <w:pStyle w:val="Heading2"/>
+        <w:keepNext/>
       </w:pPr>
       <w:r>
         <w:rPr>
@@ -7249,7 +7243,7 @@
           <w:i w:val="0"/>
           <w:sz w:val="21"/>
         </w:rPr>
-        <w:t>Timed question, page 21.</w:t>
+        <w:t>Timed question.</w:t>
       </w:r>
     </w:p>
     <w:p>
@@ -7259,7 +7253,7 @@
           <w:i w:val="0"/>
           <w:sz w:val="21"/>
         </w:rPr>
-        <w:t>Tag key, page 8.</w:t>
+        <w:t>Tag key.</w:t>
       </w:r>
     </w:p>
     <w:p>
@@ -7269,12 +7263,13 @@
           <w:i w:val="0"/>
           <w:sz w:val="21"/>
         </w:rPr>
-        <w:t>Peer marking sheet, page 22.</w:t>
+        <w:t>Peer marking sheet.</w:t>
       </w:r>
     </w:p>
     <w:p>
       <w:pPr>
         <w:pStyle w:val="Heading2"/>
+        <w:keepNext/>
       </w:pPr>
       <w:r>
         <w:rPr>
@@ -7294,13 +7289,9 @@
       </w:r>
     </w:p>
     <w:p>
-      <w:r>
-        <w:br w:type="page"/>
-      </w:r>
-    </w:p>
-    <w:p>
       <w:pPr>
         <w:pStyle w:val="Heading1"/>
+        <w:keepNext/>
       </w:pPr>
       <w:r>
         <w:rPr>
@@ -7910,6 +7901,7 @@
     <w:p>
       <w:pPr>
         <w:pStyle w:val="Heading2"/>
+        <w:keepNext/>
       </w:pPr>
       <w:r>
         <w:rPr>
@@ -7925,7 +7917,7 @@
           <w:i w:val="0"/>
           <w:sz w:val="21"/>
         </w:rPr>
-        <w:t>Verity Coffee is considering raising prices by 6 per cent across its range in order to restore its operating margin. Evaluate this decision.  (20 marks)</w:t>
+        <w:t>Verity Coffee is considering raising prices by 6 per cent across its range in order to restore its operating margin. Evaluate this decision. (20 marks)</w:t>
       </w:r>
     </w:p>
     <w:tbl>
@@ -8123,12 +8115,13 @@
           <w:i/>
           <w:sz w:val="21"/>
         </w:rPr>
-        <w:t>Thirty minutes of writing. Use the figures on pages 9 and 10. A strong answer will notice that a 6 per cent price rise on £96 million of revenue is worth about £5.8 million if volume holds, which is more than the entire current operating profit, and will then ask what happens to volume in a market where the competing product is fifty metres away. The best answers will reach for the margin history rather than treating the decision in isolation.</w:t>
+        <w:t>Thirty minutes of writing. Use the figures. A strong answer will notice that a 6 per cent price rise on £96 million of revenue is worth about £5.8 million if volume holds, which is more than the entire current operating profit, and will then ask what happens to volume in a market where the competing product is fifty metres away. The best answers will reach for the margin history rather than treating the decision in isolation.</w:t>
       </w:r>
     </w:p>
     <w:p>
       <w:pPr>
         <w:pStyle w:val="Heading2"/>
+        <w:keepNext/>
       </w:pPr>
       <w:r>
         <w:rPr>
@@ -8394,13 +8387,9 @@
       </w:r>
     </w:p>
     <w:p>
-      <w:r>
-        <w:br w:type="page"/>
-      </w:r>
-    </w:p>
-    <w:p>
       <w:pPr>
         <w:pStyle w:val="Heading1"/>
+        <w:keepNext/>
       </w:pPr>
       <w:r>
         <w:rPr>
@@ -8942,12 +8931,13 @@
             <w:tcW w:type="dxa" w:w="3742"/>
           </w:tcPr>
           <w:p>
-            <w:r/>
-            <w:r>
-              <w:rPr>
-                <w:sz w:val="19"/>
-              </w:rPr>
-              <w:t>Show the short model on page 16. Same band, well under half the words.</w:t>
+            <w:r>
+              <w:t>Show the short model. Same band, well under half the words.</w:t>
+            </w:r>
+            <w:r>
+              <w:rPr>
+                <w:sz w:val="19"/>
+              </w:rPr>
             </w:r>
           </w:p>
         </w:tc>
@@ -9088,6 +9078,7 @@
     <w:p>
       <w:pPr>
         <w:pStyle w:val="Heading2"/>
+        <w:keepNext/>
       </w:pPr>
       <w:r>
         <w:rPr>
@@ -9443,6 +9434,7 @@
     <w:p>
       <w:pPr>
         <w:pStyle w:val="Heading2"/>
+        <w:keepNext/>
       </w:pPr>
       <w:r>
         <w:rPr>
@@ -9796,13 +9788,9 @@
       </w:tr>
     </w:tbl>
     <w:p>
-      <w:r>
-        <w:br w:type="page"/>
-      </w:r>
-    </w:p>
-    <w:p>
       <w:pPr>
         <w:pStyle w:val="Heading1"/>
+        <w:keepNext/>
       </w:pPr>
       <w:r>
         <w:rPr>
@@ -10115,8 +10103,8 @@
       </w:r>
     </w:p>
     <w:sectPr>
-      <w:pgSz w:w="12240" w:h="15840"/>
-      <w:pgMar w:top="1020" w:right="1077" w:bottom="1020" w:left="1077" w:header="720" w:footer="720" w:gutter="0"/>
+      <w:pgSz w:w="11906" w:h="16838"/>
+      <w:pgMar w:top="1520" w:right="900" w:bottom="1100" w:left="900" w:header="720" w:footer="720" w:gutter="0"/>
       <w:cols w:space="720"/>
       <w:docGrid w:linePitch="360"/>
     </w:sectPr>

</xml_diff>

<commit_message>
Trust pages, quality audit fixes, and clean pack exports
Adds About (founder story), Contact, Refund policy, Privacy and Terms pages; links them in nav and footers site wide. Applies 46 verified audit fixes across 23 resource pages (wrong spec tags, stale exam dates, overclaimed counts, factual corrections, em dash sweep to 0 on every touched page). Rebuilds all three Community Edition packs: orphaned references removed, duplicate headings deduped, editable-version claim reworded truthfully.

Co-Authored-By: Claude Fable 5 <noreply@anthropic.com>
</commit_message>
<xml_diff>
--- a/resources/a-level-business-evaluation-which-sentence-earns-which-mark/A-Level-Business-Evaluation-Which-Sentence-Earns-Which-Mark-Community-Edition-EDITABLE.docx
+++ b/resources/a-level-business-evaluation-which-sentence-earns-which-mark/A-Level-Business-Evaluation-Which-Sentence-Earns-Which-Mark-Community-Edition-EDITABLE.docx
@@ -30,24 +30,12 @@
           <w:i w:val="0"/>
           <w:sz w:val="21"/>
         </w:rPr>
-        <w:t>This is the editable version. Every lesson, all three annotated model answers, the mid band rewrite and every table are ordinary Word text. Change the business, swap a question, cut a task, or adapt the annotations to your own mark scheme. A PowerPoint version of the four lessons is in the same download.</w:t>
+        <w:t>The editable Word version is included in this download. Every lesson, all three annotated model answers, the mid band rewrite and every table are ordinary Word text. Change the business, swap a question, cut a task, or adapt the annotations to your own mark scheme. A PowerPoint version of the four lessons is in the same download.</w:t>
       </w:r>
     </w:p>
     <w:p>
       <w:pPr>
         <w:pStyle w:val="Heading1"/>
-        <w:keepNext/>
-      </w:pPr>
-      <w:r>
-        <w:rPr>
-          <w:color w:val="111111"/>
-        </w:rPr>
-        <w:t>What this pack is</w:t>
-      </w:r>
-    </w:p>
-    <w:p>
-      <w:pPr>
-        <w:pStyle w:val="Heading2"/>
         <w:keepNext/>
       </w:pPr>
       <w:r>
@@ -10051,7 +10039,7 @@
           <w:i w:val="0"/>
           <w:sz w:val="21"/>
         </w:rPr>
-        <w:t>This is the editable version. Change anything you like. It is your classroom.</w:t>
+        <w:t>The editable Word version is included in this download. Change anything you like. It is your classroom.</w:t>
       </w:r>
     </w:p>
     <w:p>

</xml_diff>